<commit_message>
docs: actualización documentación modelo de base de datos
</commit_message>
<xml_diff>
--- a/documentación/Documento Arquitectura Frond-end.docx
+++ b/documentación/Documento Arquitectura Frond-end.docx
@@ -9557,23 +9557,7 @@
           <w:sz w:val="24"/>
           <w:szCs w:val="24"/>
         </w:rPr>
-        <w:t xml:space="preserve">En primer lugar, al ingresar a la aplicación, se solicita a la usuaria el </w:t>
-      </w:r>
-      <w:r>
-        <w:rPr>
-          <w:rFonts w:ascii="Arial" w:hAnsi="Arial" w:cs="Arial"/>
-          <w:sz w:val="24"/>
-          <w:szCs w:val="24"/>
-        </w:rPr>
-        <w:t>permiso de notificaciones</w:t>
-      </w:r>
-      <w:r>
-        <w:rPr>
-          <w:rFonts w:ascii="Arial" w:hAnsi="Arial" w:cs="Arial"/>
-          <w:sz w:val="24"/>
-          <w:szCs w:val="24"/>
-        </w:rPr>
-        <w:t xml:space="preserve">, el cual puede aceptar o rechazar. Posteriormente, es dirigida a la pantalla de </w:t>
+        <w:t xml:space="preserve">En primer lugar, al ingresar a la aplicación es dirigida a la pantalla de </w:t>
       </w:r>
       <w:r>
         <w:rPr>
@@ -13604,6 +13588,7 @@
                 <w:color w:val="000000" w:themeColor="text1"/>
               </w:rPr>
             </w:pPr>
+            <w:proofErr w:type="spellStart"/>
             <w:r>
               <w:rPr>
                 <w:rFonts w:ascii="Calibri" w:eastAsia="Calibri" w:hAnsi="Calibri" w:cs="Calibri"/>
@@ -13613,6 +13598,7 @@
               </w:rPr>
               <w:t>Adapter</w:t>
             </w:r>
+            <w:proofErr w:type="spellEnd"/>
           </w:p>
         </w:tc>
         <w:tc>
@@ -14383,15 +14369,27 @@
         </w:rPr>
         <w:t xml:space="preserve">La utilización de patrones de diseño como </w:t>
       </w:r>
-      <w:r>
-        <w:rPr>
-          <w:rFonts w:ascii="Arial" w:hAnsi="Arial" w:cs="Arial"/>
-          <w:b/>
-          <w:bCs/>
-          <w:sz w:val="24"/>
-          <w:szCs w:val="24"/>
-        </w:rPr>
-        <w:t xml:space="preserve">Observer, </w:t>
+      <w:proofErr w:type="spellStart"/>
+      <w:r>
+        <w:rPr>
+          <w:rFonts w:ascii="Arial" w:hAnsi="Arial" w:cs="Arial"/>
+          <w:b/>
+          <w:bCs/>
+          <w:sz w:val="24"/>
+          <w:szCs w:val="24"/>
+        </w:rPr>
+        <w:t>Observer</w:t>
+      </w:r>
+      <w:proofErr w:type="spellEnd"/>
+      <w:r>
+        <w:rPr>
+          <w:rFonts w:ascii="Arial" w:hAnsi="Arial" w:cs="Arial"/>
+          <w:b/>
+          <w:bCs/>
+          <w:sz w:val="24"/>
+          <w:szCs w:val="24"/>
+        </w:rPr>
+        <w:t xml:space="preserve">, </w:t>
       </w:r>
       <w:proofErr w:type="spellStart"/>
       <w:r>
@@ -23555,25 +23553,6 @@
 </file>
 
 <file path=customXml/item1.xml><?xml version="1.0" encoding="utf-8"?>
-<p:properties xmlns:p="http://schemas.microsoft.com/office/2006/metadata/properties" xmlns:xsi="http://www.w3.org/2001/XMLSchema-instance" xmlns:pc="http://schemas.microsoft.com/office/infopath/2007/PartnerControls">
-  <documentManagement/>
-</p:properties>
-</file>
-
-<file path=customXml/item2.xml><?xml version="1.0" encoding="utf-8"?>
-<?mso-contentType ?>
-<FormTemplates xmlns="http://schemas.microsoft.com/sharepoint/v3/contenttype/forms">
-  <Display>DocumentLibraryForm</Display>
-  <Edit>DocumentLibraryForm</Edit>
-  <New>DocumentLibraryForm</New>
-</FormTemplates>
-</file>
-
-<file path=customXml/item3.xml><?xml version="1.0" encoding="utf-8"?>
-<b:Sources xmlns:b="http://schemas.openxmlformats.org/officeDocument/2006/bibliography" xmlns="http://schemas.openxmlformats.org/officeDocument/2006/bibliography" SelectedStyle="\APASixthEditionOfficeOnline.xsl" StyleName="APA" Version="6"/>
-</file>
-
-<file path=customXml/item4.xml><?xml version="1.0" encoding="utf-8"?>
 <ct:contentTypeSchema xmlns:ct="http://schemas.microsoft.com/office/2006/metadata/contentType" xmlns:ma="http://schemas.microsoft.com/office/2006/metadata/properties/metaAttributes" ct:_="" ma:_="" ma:contentTypeName="Documento" ma:contentTypeID="0x010100E60B18A11A122F4494AD3F92FEDB91C2" ma:contentTypeVersion="5" ma:contentTypeDescription="Crear nuevo documento." ma:contentTypeScope="" ma:versionID="02dde973f02426317c0057870bcab457">
   <xsd:schema xmlns:xsd="http://www.w3.org/2001/XMLSchema" xmlns:xs="http://www.w3.org/2001/XMLSchema" xmlns:p="http://schemas.microsoft.com/office/2006/metadata/properties" xmlns:ns3="3728a013-43ad-4cbc-b615-a59aeaa44ada" targetNamespace="http://schemas.microsoft.com/office/2006/metadata/properties" ma:root="true" ma:fieldsID="5be676f6ded18f1f2cd47a110a6e209b" ns3:_="">
     <xsd:import namespace="3728a013-43ad-4cbc-b615-a59aeaa44ada"/>
@@ -23723,32 +23702,26 @@
 </ct:contentTypeSchema>
 </file>
 
-<file path=customXml/itemProps1.xml><?xml version="1.0" encoding="utf-8"?>
-<ds:datastoreItem xmlns:ds="http://schemas.openxmlformats.org/officeDocument/2006/customXml" ds:itemID="{1FB32DCC-63C1-456F-84E9-324471C5BF03}">
-  <ds:schemaRefs>
-    <ds:schemaRef ds:uri="http://schemas.microsoft.com/office/2006/metadata/properties"/>
-    <ds:schemaRef ds:uri="http://schemas.microsoft.com/office/infopath/2007/PartnerControls"/>
-  </ds:schemaRefs>
-</ds:datastoreItem>
+<file path=customXml/item2.xml><?xml version="1.0" encoding="utf-8"?>
+<b:Sources xmlns:b="http://schemas.openxmlformats.org/officeDocument/2006/bibliography" xmlns="http://schemas.openxmlformats.org/officeDocument/2006/bibliography" SelectedStyle="\APASixthEditionOfficeOnline.xsl" StyleName="APA" Version="6"/>
 </file>
 
-<file path=customXml/itemProps2.xml><?xml version="1.0" encoding="utf-8"?>
-<ds:datastoreItem xmlns:ds="http://schemas.openxmlformats.org/officeDocument/2006/customXml" ds:itemID="{3ED20176-87E6-4383-AF52-DA979B4852BE}">
-  <ds:schemaRefs>
-    <ds:schemaRef ds:uri="http://schemas.microsoft.com/sharepoint/v3/contenttype/forms"/>
-  </ds:schemaRefs>
-</ds:datastoreItem>
+<file path=customXml/item3.xml><?xml version="1.0" encoding="utf-8"?>
+<?mso-contentType ?>
+<FormTemplates xmlns="http://schemas.microsoft.com/sharepoint/v3/contenttype/forms">
+  <Display>DocumentLibraryForm</Display>
+  <Edit>DocumentLibraryForm</Edit>
+  <New>DocumentLibraryForm</New>
+</FormTemplates>
 </file>
 
-<file path=customXml/itemProps3.xml><?xml version="1.0" encoding="utf-8"?>
-<ds:datastoreItem xmlns:ds="http://schemas.openxmlformats.org/officeDocument/2006/customXml" ds:itemID="{08F32313-75F4-400C-9026-C83AA6E4864C}">
-  <ds:schemaRefs>
-    <ds:schemaRef ds:uri="http://schemas.openxmlformats.org/officeDocument/2006/bibliography"/>
-  </ds:schemaRefs>
-</ds:datastoreItem>
+<file path=customXml/item4.xml><?xml version="1.0" encoding="utf-8"?>
+<p:properties xmlns:p="http://schemas.microsoft.com/office/2006/metadata/properties" xmlns:xsi="http://www.w3.org/2001/XMLSchema-instance" xmlns:pc="http://schemas.microsoft.com/office/infopath/2007/PartnerControls">
+  <documentManagement/>
+</p:properties>
 </file>
 
-<file path=customXml/itemProps4.xml><?xml version="1.0" encoding="utf-8"?>
+<file path=customXml/itemProps1.xml><?xml version="1.0" encoding="utf-8"?>
 <ds:datastoreItem xmlns:ds="http://schemas.openxmlformats.org/officeDocument/2006/customXml" ds:itemID="{B2378BA0-4750-467D-A507-5858DEC7D1B4}">
   <ds:schemaRefs>
     <ds:schemaRef ds:uri="http://schemas.microsoft.com/office/2006/metadata/contentType"/>
@@ -23764,4 +23737,29 @@
     <ds:schemaRef ds:uri="http://schemas.microsoft.com/internal/obd"/>
   </ds:schemaRefs>
 </ds:datastoreItem>
+</file>
+
+<file path=customXml/itemProps2.xml><?xml version="1.0" encoding="utf-8"?>
+<ds:datastoreItem xmlns:ds="http://schemas.openxmlformats.org/officeDocument/2006/customXml" ds:itemID="{08F32313-75F4-400C-9026-C83AA6E4864C}">
+  <ds:schemaRefs>
+    <ds:schemaRef ds:uri="http://schemas.openxmlformats.org/officeDocument/2006/bibliography"/>
+  </ds:schemaRefs>
+</ds:datastoreItem>
+</file>
+
+<file path=customXml/itemProps3.xml><?xml version="1.0" encoding="utf-8"?>
+<ds:datastoreItem xmlns:ds="http://schemas.openxmlformats.org/officeDocument/2006/customXml" ds:itemID="{3ED20176-87E6-4383-AF52-DA979B4852BE}">
+  <ds:schemaRefs>
+    <ds:schemaRef ds:uri="http://schemas.microsoft.com/sharepoint/v3/contenttype/forms"/>
+  </ds:schemaRefs>
+</ds:datastoreItem>
+</file>
+
+<file path=customXml/itemProps4.xml><?xml version="1.0" encoding="utf-8"?>
+<ds:datastoreItem xmlns:ds="http://schemas.openxmlformats.org/officeDocument/2006/customXml" ds:itemID="{1FB32DCC-63C1-456F-84E9-324471C5BF03}">
+  <ds:schemaRefs>
+    <ds:schemaRef ds:uri="http://schemas.microsoft.com/office/2006/metadata/properties"/>
+    <ds:schemaRef ds:uri="http://schemas.microsoft.com/office/infopath/2007/PartnerControls"/>
+  </ds:schemaRefs>
+</ds:datastoreItem>
 </file>
</xml_diff>